<commit_message>
fix: 补齐 5.1 节的子节编号 (5.1.1/5.1.2/5.1.3)
5.1 章节下原本只有 5.1.4 一个显式子节标题（饲料效率与代谢相关性状），
但前面骨骼肌、脂肪沉积、肉质形成三段实际上构成了三个并列子节，缺少父级编号，
导致 5.1 与 5.1.4 之间的层级出现跳跃。

本次更新在不改动正文内容的前提下补齐：
- 5.1.1 骨骼肌发育与产肉性能
- 5.1.2 脂肪沉积与体型相关变异
- 5.1.3 肉质形成与风味物质代谢
- 5.1.4 饲料效率与代谢相关性状（保持原编号）

Co-authored-by: FlatIsabella893 <284653963+FlatIsabella893@users.noreply.github.com>
</commit_message>
<xml_diff>
--- a/家鸡遗传学综述_v2 (11).docx
+++ b/家鸡遗传学综述_v2 (11).docx
@@ -2323,6 +2323,11 @@
       </w:r>
     </w:p>
     <w:p>
+      <w:r>
+        <w:t xml:space="preserve">5.1.1 骨骼肌发育与产肉性能</w:t>
+      </w:r>
+    </w:p>
+    <w:p>
       <w:pPr>
         <w:spacing w:line="360" w:lineRule="auto"/>
         <w:ind w:firstLine="420"/>
@@ -2336,6 +2341,11 @@
       </w:r>
     </w:p>
     <w:p>
+      <w:r>
+        <w:t xml:space="preserve">5.1.2 脂肪沉积与体型相关变异</w:t>
+      </w:r>
+    </w:p>
+    <w:p>
       <w:pPr>
         <w:spacing w:line="360" w:lineRule="auto"/>
         <w:ind w:firstLine="420"/>
@@ -2359,6 +2369,11 @@
           <w:sz w:val="22"/>
         </w:rPr>
         <w:t>近年来,生长与胴体性状研究已进一步从“SNP层面的关联定位”转向“多类型变异联合解释”。Wang等构建的鸡泛基因组显示,不同鸡群之间存在显著的基因内容变异和参考缺失序列,并进一步鉴定到影响体型的重要变异——位于IGF2BP1启动子区域的缺失突变;该缺失能够提高IGF2BP1的转录活性和表达水平,并与商业鸡体型增大相关[8]。这一结果具有代表性,因为它说明家鸡生长性状的重要遗传基础并不完全存在于常规SNP芯片容易捕获的变异中,结构变异与参考缺失序列同样可能发挥关键作用。</w:t>
+      </w:r>
+    </w:p>
+    <w:p>
+      <w:r>
+        <w:t xml:space="preserve">5.1.3 肉质形成与风味物质代谢</w:t>
       </w:r>
     </w:p>
     <w:p>

</xml_diff>